<commit_message>
Pre-remplissage RFM/DP/DIF/CISSCT/PV-PC depuis les donnees deja connues
</commit_message>
<xml_diff>
--- a/complet/modeles/CSPS17_CISSCT_CR_Reunion_v2.docx
+++ b/complet/modeles/CSPS17_CISSCT_CR_Reunion_v2.docx
@@ -1143,26 +1143,34 @@
               <w:right w:w="120" w:type="dxa"/>
             </w:tcMar>
           </w:tcPr>
-          <w:p/>
-        </w:tc>
-        <w:tc>
-          <w:tcPr>
-            <w:tcW w:w="0" w:type="auto"/>
-            <w:tcBorders>
-              <w:top w:val="single" w:sz="4" w:space="0" w:color="CCCCCC"/>
-              <w:left w:val="single" w:sz="4" w:space="0" w:color="CCCCCC"/>
-              <w:bottom w:val="single" w:sz="4" w:space="0" w:color="CCCCCC"/>
-              <w:right w:val="single" w:sz="4" w:space="0" w:color="CCCCCC"/>
-            </w:tcBorders>
-            <w:shd w:val="clear" w:color="auto" w:fill="F2F2F2"/>
-            <w:tcMar>
-              <w:top w:w="70" w:type="dxa"/>
-              <w:left w:w="120" w:type="dxa"/>
-              <w:bottom w:w="70" w:type="dxa"/>
-              <w:right w:w="120" w:type="dxa"/>
-            </w:tcMar>
-          </w:tcPr>
-          <w:p/>
+          <w:p>
+            <w:r>
+              <w:t>{{moe_contact}}</w:t>
+            </w:r>
+          </w:p>
+        </w:tc>
+        <w:tc>
+          <w:tcPr>
+            <w:tcW w:w="0" w:type="auto"/>
+            <w:tcBorders>
+              <w:top w:val="single" w:sz="4" w:space="0" w:color="CCCCCC"/>
+              <w:left w:val="single" w:sz="4" w:space="0" w:color="CCCCCC"/>
+              <w:bottom w:val="single" w:sz="4" w:space="0" w:color="CCCCCC"/>
+              <w:right w:val="single" w:sz="4" w:space="0" w:color="CCCCCC"/>
+            </w:tcBorders>
+            <w:shd w:val="clear" w:color="auto" w:fill="F2F2F2"/>
+            <w:tcMar>
+              <w:top w:w="70" w:type="dxa"/>
+              <w:left w:w="120" w:type="dxa"/>
+              <w:bottom w:w="70" w:type="dxa"/>
+              <w:right w:w="120" w:type="dxa"/>
+            </w:tcMar>
+          </w:tcPr>
+          <w:p>
+            <w:r>
+              <w:t>{{moe_nom}}</w:t>
+            </w:r>
+          </w:p>
         </w:tc>
         <w:tc>
           <w:tcPr>
@@ -1376,7 +1384,11 @@
               <w:right w:w="120" w:type="dxa"/>
             </w:tcMar>
           </w:tcPr>
-          <w:p/>
+          <w:p>
+            <w:r>
+              <w:t>{{dreets_nom}}</w:t>
+            </w:r>
+          </w:p>
         </w:tc>
         <w:tc>
           <w:tcPr>
@@ -1483,7 +1495,11 @@
               <w:right w:w="120" w:type="dxa"/>
             </w:tcMar>
           </w:tcPr>
-          <w:p/>
+          <w:p>
+            <w:r>
+              <w:t>{{carsat_nom}}</w:t>
+            </w:r>
+          </w:p>
         </w:tc>
         <w:tc>
           <w:tcPr>
@@ -1590,7 +1606,11 @@
               <w:right w:w="120" w:type="dxa"/>
             </w:tcMar>
           </w:tcPr>
-          <w:p/>
+          <w:p>
+            <w:r>
+              <w:t>{{oppbtp_nom}}</w:t>
+            </w:r>
+          </w:p>
         </w:tc>
         <w:tc>
           <w:tcPr>

</xml_diff>